<commit_message>
Programmes batches 8-9: Cybersecurity (35-37, 39) and Technical & Academic Writing (EN + FR)
Cold-read fixes: Security Onion as the single SIEM, 200-201 v1.2 topics, lab
order in Network Security, Packet Tracer-feasible validation, CISA ZTMM v2.0.

Co-Authored-By: Claude Opus 5.5 <noreply@anthropic.com>
</commit_message>
<xml_diff>
--- a/res/programmes/Analyste-SOC-CCNA-Cybersecurity-57h.docx
+++ b/res/programmes/Analyste-SOC-CCNA-Cybersecurity-57h.docx
@@ -92,7 +92,7 @@
         <w:t>Pour</w:t>
       </w:r>
       <w:r>
-        <w:t xml:space="preserve">   Personnels IT et réseau qui se tournent vers les opérations de sécurité</w:t>
+        <w:t xml:space="preserve">   Professionnels IT et réseau qui évoluent vers les opérations de sécurité</w:t>
       </w:r>
     </w:p>
     <w:p>
@@ -212,7 +212,7 @@
         <w:pStyle w:val="ProgBody"/>
       </w:pPr>
       <w:r>
-        <w:t>Ce programme prépare les participants au métier d’analyste dans un centre opérationnel de sécurité (SOC) et à l’examen Cisco CCNA Cybersecurity (200-201 CBROPS). Ils analysent les systèmes Windows et Linux, le réseau et son infrastructure de sécurité du point de vue de l’analyste, la cryptographie, les terminaux et les logiciels malveillants, puis détectent les attaques dans un SIEM avec MITRE ATT&amp;CK et Sigma, utilisent le renseignement sur les menaces et le tri assisté par l’IA, et enquêtent sur les incidents selon la NIST SP 800-61 Rév. 3. Le programme s’achève par une simulation de SOC sur une attaque capturée.</w:t>
+        <w:t>Ce programme prépare les participants au métier d’analyste dans un centre opérationnel de sécurité (SOC) et à l’examen Cisco CCNA Cybersecurity (200-201 CBROPS). Ils découvrent le fonctionnement d’un SOC, analysent Windows, Linux, le réseau, la cryptographie, les terminaux et les logiciels malveillants du point de vue de l’analyste, détectent les attaques dans un SIEM avec MITRE ATT&amp;CK et Sigma, utilisent le renseignement sur les menaces et le tri assisté par l’IA, enquêtent selon la NIST SP 800-61 Rev. 3 et appliquent les procédures de sécurité. Chaque chapitre se termine par un TP, et le programme s’achève par une simulation de SOC sur une attaque capturée.</w:t>
       </w:r>
     </w:p>
     <w:p>
@@ -321,7 +321,7 @@
               <w:keepNext/>
             </w:pPr>
             <w:r>
-              <w:t>Fondamentaux du SOC et systèmes</w:t>
+              <w:t>Fondamentaux et systèmes</w:t>
             </w:r>
           </w:p>
         </w:tc>
@@ -393,7 +393,7 @@
               <w:keepNext/>
             </w:pPr>
             <w:r>
-              <w:t>Protocoles, infrastructure de sécurité, attaques, tcpdump, Wireshark, NetFlow</w:t>
+              <w:t>Protocoles, infrastructure de sécurité, attaques, Wireshark, NetFlow</w:t>
             </w:r>
           </w:p>
         </w:tc>
@@ -437,7 +437,7 @@
               <w:keepNext/>
             </w:pPr>
             <w:r>
-              <w:t>Cryptographie, terminaux et logiciels malveillants</w:t>
+              <w:t>Cryptographie et terminaux</w:t>
             </w:r>
           </w:p>
         </w:tc>
@@ -451,7 +451,7 @@
               <w:keepNext/>
             </w:pPr>
             <w:r>
-              <w:t>Cryptographie et PKI, protection des terminaux, vulnérabilités, analyse de logiciels malveillants</w:t>
+              <w:t>Cryptographie, terminaux, vulnérabilités, logiciels malveillants</w:t>
             </w:r>
           </w:p>
         </w:tc>
@@ -495,7 +495,7 @@
               <w:keepNext/>
             </w:pPr>
             <w:r>
-              <w:t>Détection et renseignement sur les menaces</w:t>
+              <w:t>Détection et renseignement</w:t>
             </w:r>
           </w:p>
         </w:tc>
@@ -509,7 +509,7 @@
               <w:keepNext/>
             </w:pPr>
             <w:r>
-              <w:t>SIEM et SOAR, Security Onion, MITRE ATT&amp;CK, Sigma, renseignement, IA</w:t>
+              <w:t>SIEM, Security Onion, ATT&amp;CK, Sigma, renseignement, IA</w:t>
             </w:r>
           </w:p>
         </w:tc>
@@ -553,7 +553,7 @@
               <w:keepNext/>
             </w:pPr>
             <w:r>
-              <w:t>Réponse aux incidents et procédures</w:t>
+              <w:t>Réponse aux incidents</w:t>
             </w:r>
           </w:p>
         </w:tc>
@@ -567,7 +567,7 @@
               <w:keepNext/>
             </w:pPr>
             <w:r>
-              <w:t>NIST SP 800-61 Rév. 3, preuves, kill chain, modèle en diamant, procédures</w:t>
+              <w:t>NIST SP 800-61 Rev. 3, preuves, kill chain, procédures</w:t>
             </w:r>
           </w:p>
         </w:tc>
@@ -812,7 +812,7 @@
               <w:pStyle w:val="ProgTableText"/>
             </w:pPr>
             <w:r>
-              <w:t>Personnels IT et réseau qui se tournent vers les opérations de sécurité</w:t>
+              <w:t>Professionnels IT et réseau qui évoluent vers les opérations de sécurité</w:t>
             </w:r>
           </w:p>
         </w:tc>
@@ -896,7 +896,7 @@
               <w:pStyle w:val="ProgTableText"/>
             </w:pPr>
             <w:r>
-              <w:t>Cours courts suivis de TP guidés sur du trafic et des journaux capturés ; un même scénario d’attaque suivi tout au long du cours</w:t>
+              <w:t>Cours courts et TP guidés sur du trafic et des journaux capturés ; un scénario d’attaque suivi tout au long du cours</w:t>
             </w:r>
           </w:p>
         </w:tc>
@@ -924,7 +924,7 @@
               <w:pStyle w:val="ProgTableText"/>
             </w:pPr>
             <w:r>
-              <w:t>Un portable par participant (16 Go de RAM) avec les machines virtuelles Cisco CyberOps Workstation et Kali Linux ; un serveur Security Onion par équipe fourni par l’organisateur ; réseau de TP isolé ; ni compte cloud ni coût</w:t>
+              <w:t>Un portable par participant (16 Go de RAM) avec une station d’analyste et une VM Kali Linux préparées par le formateur ; un serveur Security Onion par équipe (4 cœurs, 24 Go de RAM), fourni par l’organisateur ; réseau de TP isolé ; ni compte cloud ni coût</w:t>
             </w:r>
           </w:p>
         </w:tc>
@@ -1001,7 +1001,7 @@
         <w:pStyle w:val="Heading1"/>
       </w:pPr>
       <w:r>
-        <w:t>Fondamentaux du SOC et systèmes</w:t>
+        <w:t>Fondamentaux et systèmes</w:t>
       </w:r>
     </w:p>
     <w:p>
@@ -1198,7 +1198,7 @@
               <w:pStyle w:val="ProgTableText"/>
             </w:pPr>
             <w:r>
-              <w:t>Triade CIA, défense en profondeur, modèles de contrôle d’accès, CVSS, risque</w:t>
+              <w:t>Triade DIC (disponibilité, intégrité, confidentialité), défense en profondeur, modèles de contrôle d’accès, CVSS, risque, surface d’attaque, analyse déterministe et probabiliste</w:t>
             </w:r>
           </w:p>
         </w:tc>
@@ -1710,7 +1710,7 @@
               <w:pStyle w:val="ProgTableText"/>
             </w:pPr>
             <w:r>
-              <w:t>tcpdump, Wireshark, NetFlow, attaques contre les protocoles et les services</w:t>
+              <w:t>tcpdump, Wireshark, NetFlow, attaques contre les protocoles et les services, types de données (capture complète, session, transaction, statistiques, métadonnées, alertes), 5-tuple, expressions régulières</w:t>
             </w:r>
           </w:p>
         </w:tc>
@@ -1757,7 +1757,7 @@
         <w:pStyle w:val="Heading1"/>
       </w:pPr>
       <w:r>
-        <w:t>Cryptographie, terminaux et logiciels malveillants</w:t>
+        <w:t>Cryptographie et terminaux</w:t>
       </w:r>
     </w:p>
     <w:p>
@@ -2068,7 +2068,7 @@
         <w:pStyle w:val="Heading1"/>
       </w:pPr>
       <w:r>
-        <w:t>Détection et renseignement sur les menaces</w:t>
+        <w:t>Détection et renseignement</w:t>
       </w:r>
     </w:p>
     <w:p>
@@ -2198,7 +2198,7 @@
               <w:pStyle w:val="ProgTableText"/>
             </w:pPr>
             <w:r>
-              <w:t>Sources de journaux, SIEM et SOAR, Security Onion, Wazuh ou Elastic</w:t>
+              <w:t>Sources de journaux, SIEM et SOAR, Security Onion (Elastic, Zeek, Suricata), autres SIEM comme Wazuh</w:t>
             </w:r>
           </w:p>
         </w:tc>
@@ -2446,7 +2446,7 @@
         <w:pStyle w:val="Heading1"/>
       </w:pPr>
       <w:r>
-        <w:t>Réponse aux incidents et procédures</w:t>
+        <w:t>Réponse aux incidents</w:t>
       </w:r>
     </w:p>
     <w:p>
@@ -2454,7 +2454,7 @@
         <w:pStyle w:val="ProgIntro"/>
       </w:pPr>
       <w:r>
-        <w:t>Les participants enquêtent sur des incidents selon la NIST SP 800-61 Rév. 3, manipulent les preuves pour qu’elles restent exploitables, reconstituent les attaques avec la kill chain et le modèle en diamant, puis travaillent avec les procédures, la gestion des actifs et les règles de conformité qui encadrent le travail du SOC. TP validé : une chronologie d’incident et une étape de procédure réalisées pour l’attaque du cours.</w:t>
+        <w:t>Les participants enquêtent sur des incidents selon la NIST SP 800-61 Rev. 3, manipulent les preuves pour qu’elles restent exploitables, reconstituent les attaques avec la kill chain et le modèle en diamant, puis travaillent avec les procédures, la gestion des actifs et les règles de conformité qui encadrent le travail du SOC. TP validé : une chronologie d’incident et une étape de procédure réalisées pour l’attaque du cours.</w:t>
       </w:r>
     </w:p>
     <w:tbl>
@@ -2576,7 +2576,7 @@
               <w:pStyle w:val="ProgTableText"/>
             </w:pPr>
             <w:r>
-              <w:t>NIST SP 800-61 Rév. 3, gestion des preuves, kill chain, modèle en diamant</w:t>
+              <w:t>NIST SP 800-61 Rev. 3, gestion des preuves, kill chain, modèle en diamant, types de preuves et chaîne de traçabilité</w:t>
             </w:r>
           </w:p>
         </w:tc>
@@ -2643,7 +2643,7 @@
               <w:pStyle w:val="ProgTableText"/>
             </w:pPr>
             <w:r>
-              <w:t>Procédures de traitement des incidents (playbooks), gestion des actifs, conformité</w:t>
+              <w:t>Procédures de traitement des incidents (playbooks), gestion des actifs, conformité (PCI DSS, HIPAA, SOX), CSIRT/PSIRT/CERT, indicateurs du SOC (délais de détection, de confinement, de réponse)</w:t>
             </w:r>
           </w:p>
         </w:tc>
@@ -2820,7 +2820,7 @@
               <w:pStyle w:val="ProgTableText"/>
             </w:pPr>
             <w:r>
-              <w:t>Trier les alertes dans Security Onion et le SIEM, enquêter sur les éléments réseau et hôte</w:t>
+              <w:t>Trier les alertes dans Security Onion, enquêter sur les éléments réseau et hôte</w:t>
             </w:r>
           </w:p>
         </w:tc>
@@ -3026,7 +3026,7 @@
         <w:t>Outils</w:t>
       </w:r>
       <w:r>
-        <w:t xml:space="preserve">  Security Onion, SIEM (Wazuh ou Elastic), Wireshark, Zeek, Suricata, Sigma, MITRE ATT&amp;CK Navigator</w:t>
+        <w:t xml:space="preserve">  Security Onion (Elastic, Zeek, Suricata), Wireshark, Sigma, MITRE ATT&amp;CK Navigator</w:t>
       </w:r>
     </w:p>
     <w:p>

</xml_diff>